<commit_message>
Master report: add part 2c (PARIVESH EC pipeline) + refresh priorities; regenerate DOCX/PDF
</commit_message>
<xml_diff>
--- a/reports/published/India_Trade_Master_Report_2026-07-19.docx
+++ b/reports/published/India_Trade_Master_Report_2026-07-19.docx
@@ -6698,6 +6698,14 @@
     </w:p>
     <w:p>
       <w:pPr>
+        <w:pStyle w:val="ListBullet"/>
+      </w:pPr>
+      <w:r>
+        <w:t>Re-pull the PARIVESH API; check flagship EC-status transitions (Dholera/Agratas ToR-&gt;EC; POSCO-JSW and RRPCL still absent?).</w:t>
+      </w:r>
+    </w:p>
+    <w:p>
+      <w:pPr>
         <w:pStyle w:val="Heading2"/>
       </w:pPr>
       <w:r>
@@ -7784,6 +7792,104 @@
     <w:p>
       <w:r>
         <w:t>No state-x-sector cross-tab published; conversion is a pipeline-affected flow ratio; Appendix V/VI headers disagree (Dec vs Nov 2025) while summing identically to Rs 5,83,096cr.</w:t>
+      </w:r>
+    </w:p>
+    <w:p>
+      <w:pPr>
+        <w:pStyle w:val="Heading2"/>
+      </w:pPr>
+      <w:r>
+        <w:t>Part 2c Ec Pipeline Parivesh</w:t>
+      </w:r>
+    </w:p>
+    <w:p>
+      <w:pPr>
+        <w:pStyle w:val="Heading3"/>
+      </w:pPr>
+      <w:r>
+        <w:t>Note</w:t>
+      </w:r>
+    </w:p>
+    <w:p>
+      <w:r>
+        <w:t>Gate 3 of the lifecycle: Environmental Clearance as the IEM A-to-B leading indicator, from PARIVESH 2.0's open JSON API (113,804 proposals, SEIAA included; industrial = IND-1/2/3; mining and auto-delisted excluded).</w:t>
+      </w:r>
+    </w:p>
+    <w:p>
+      <w:pPr>
+        <w:pStyle w:val="Heading3"/>
+      </w:pPr>
+      <w:r>
+        <w:t>Headlines</w:t>
+      </w:r>
+    </w:p>
+    <w:p>
+      <w:pPr>
+        <w:pStyle w:val="ListBullet"/>
+      </w:pPr>
+      <w:r>
+        <w:t>Gujarat: 1,049 industrial ECs granted (~31% of all-India) + 836 ToR-granted -- the deepest pipeline, predicting its 33.8% IEM implementation share continues.</w:t>
+      </w:r>
+    </w:p>
+    <w:p>
+      <w:pPr>
+        <w:pStyle w:val="ListBullet"/>
+      </w:pPr>
+      <w:r>
+        <w:t>Maharashtra: ToR (519) exceeds granted (390) -- the most forward-loaded state.</w:t>
+      </w:r>
+    </w:p>
+    <w:p>
+      <w:pPr>
+        <w:pStyle w:val="ListBullet"/>
+      </w:pPr>
+      <w:r>
+        <w:t>Grant flow accelerating: 198 (2023) -&gt; 734 (2024) -&gt; 1,102 (2025) -&gt; 579 (2026 YTD).</w:t>
+      </w:r>
+    </w:p>
+    <w:p>
+      <w:pPr>
+        <w:pStyle w:val="ListBullet"/>
+      </w:pPr>
+      <w:r>
+        <w:t>Sector corroboration: synthetic organic chemicals #1 (1,192 granted, Gujarat 56%), metallurgy #2 (641, multi-state), distilleries 504 (the ethanol wave).</w:t>
+      </w:r>
+    </w:p>
+    <w:p>
+      <w:pPr>
+        <w:pStyle w:val="ListBullet"/>
+      </w:pPr>
+      <w:r>
+        <w:t>Flagships: Dholera fab + Assam ATMP at ToR; Micron/Kaynes/Reliance-electrolyser EC-granted; all 3 Bulk Drug Parks + 3 PM MITRA parks cleared.</w:t>
+      </w:r>
+    </w:p>
+    <w:p>
+      <w:pPr>
+        <w:pStyle w:val="ListBullet"/>
+      </w:pPr>
+      <w:r>
+        <w:t>NEGATIVE FINDINGS: POSCO-JSW JV has no EC application; RRPCL entirely absent from the 2022+ register -- clearance-proof of 'stalled at MoU'.</w:t>
+      </w:r>
+    </w:p>
+    <w:p>
+      <w:pPr>
+        <w:pStyle w:val="ListBullet"/>
+      </w:pPr>
+      <w:r>
+        <w:t>Method: the open API (advanceSearchData) is the most refresh-friendly source in the stack -- one GET call; on the quarterly checklist.</w:t>
+      </w:r>
+    </w:p>
+    <w:p>
+      <w:pPr>
+        <w:pStyle w:val="Heading3"/>
+      </w:pPr>
+      <w:r>
+        <w:t>Filters</w:t>
+      </w:r>
+    </w:p>
+    <w:p>
+      <w:r>
+        <w:t>EC categories != IEM industries (electronics/battery plants have no EC category -- named-project search only); no bulk grant dates; one EC != one IEM-scale project; 2022+ submissions only.</w:t>
       </w:r>
     </w:p>
     <w:sectPr>

</xml_diff>